<commit_message>
v2.35 (John's word, 13 October): Evening 14 - the frame sentence ('From here, the evenings stop holding you, and you start holding the practice'), the last stretch as three evenings, the sending lines; Evening 15's planning lab carries the mercy-card rehearsal
Co-Authored-By: Claude Opus 5.5 <noreply@anthropic.com>
</commit_message>
<xml_diff>
--- a/_implementation-notes/evening-series/FotH Evening Session 18 Leader Notes DRAFT v1.docx
+++ b/_implementation-notes/evening-series/FotH Evening Session 18 Leader Notes DRAFT v1.docx
@@ -1118,7 +1118,7 @@
         <w:spacing w:before="0" w:after="60"/>
       </w:pPr>
       <w:r>
-        <w:t>1. Write the five lines live on the whiteboard, saying each: Wk 19 the teens teach the two mercy cards in pairs; Wk 20 The Long Walk — the seniors teach the whole room, journals come; Wk 21 Sending and Blessing — whole families, a TWO-HOUR night; Wk 22 the Commissioning of the Companions.</w:t>
+        <w:t>1. Write the three lines live on the whiteboard, saying each: Evening 15, The Long Walk — the Companions-in-Formation teach the two mercy cards, journals come; Evening 16, Sending and Blessing — whole families, a TWO-HOUR night; Evening 17, the Commissioning of the Companions.</w:t>
       </w:r>
     </w:p>
     <w:p>
@@ -1129,7 +1129,7 @@
         <w:spacing w:before="0" w:after="60"/>
       </w:pPr>
       <w:r>
-        <w:t>2. Land the frame sentence: the year now begins to hand itself over — that was always the plan.</w:t>
+        <w:t>2. Land the frame sentence (John's word, 13 October): 'From here, the evenings stop holding you, and you start holding the practice.' The teens have led from the first night; what steps back now is the structure, and that was always the plan.</w:t>
       </w:r>
     </w:p>
     <w:p>
@@ -1995,7 +1995,7 @@
         <w:spacing w:before="0" w:after="60"/>
       </w:pPr>
       <w:r>
-        <w:t>1. One sentence for the road: you came back like people who know the way — five weeks to the sending; the season is His, and it is nearly harvest.</w:t>
+        <w:t>1. One sentence for the road: you came back like people who know the way — two evenings to the sending; the season is His, and it is nearly harvest.</w:t>
       </w:r>
     </w:p>
     <w:p>
@@ -2017,7 +2017,7 @@
         <w:spacing w:before="0" w:after="60"/>
       </w:pPr>
       <w:r>
-        <w:t>3. Send them glad: see you evenings — Week 19, the teens have the cards.</w:t>
+        <w:t>3. Send them glad: see you in two weeks — Evening 15, the teens have the cards.</w:t>
       </w:r>
     </w:p>
     <w:p>

</xml_diff>

<commit_message>
v2.36 (John's word, 13 October): Evening 14 - Ready, and Not Yet (everyone, parents first); the invitation list for the follow-up series in the homework and preparation sentence; master pages from Evening 14 on +1 (324)
Co-Authored-By: Claude Opus 5.5 <noreply@anthropic.com>
</commit_message>
<xml_diff>
--- a/_implementation-notes/evening-series/FotH Evening Session 18 Leader Notes DRAFT v1.docx
+++ b/_implementation-notes/evening-series/FotH Evening Session 18 Leader Notes DRAFT v1.docx
@@ -45,7 +45,7 @@
           <w:color w:val="595959"/>
           <w:sz w:val="18"/>
         </w:rPr>
-        <w:t>Match the big number on each block to the number in the bottom-right corner of the screen. This session is 256–268 in the series' one continuous numbering. The first slide, the series title, is “Title” here.</w:t>
+        <w:t>Match the big number on each block to the number in the bottom-right corner of the screen. This session is 256–269 in the series' one continuous numbering. The first slide, the series title, is “Title” here.</w:t>
       </w:r>
     </w:p>
     <w:p>
@@ -147,7 +147,7 @@
           <w:color w:val="7F7F7F"/>
           <w:sz w:val="16"/>
         </w:rPr>
-        <w:t xml:space="preserve">   · slide 1 of 14</w:t>
+        <w:t xml:space="preserve">   · slide 1 of 15</w:t>
       </w:r>
     </w:p>
     <w:p>
@@ -219,7 +219,7 @@
           <w:color w:val="7F7F7F"/>
           <w:sz w:val="16"/>
         </w:rPr>
-        <w:t xml:space="preserve">   · slide 2 of 14</w:t>
+        <w:t xml:space="preserve">   · slide 2 of 15</w:t>
       </w:r>
     </w:p>
     <w:p>
@@ -291,7 +291,7 @@
           <w:color w:val="7F7F7F"/>
           <w:sz w:val="16"/>
         </w:rPr>
-        <w:t xml:space="preserve">   · slide 3 of 14</w:t>
+        <w:t xml:space="preserve">   · slide 3 of 15</w:t>
       </w:r>
     </w:p>
     <w:p>
@@ -434,7 +434,7 @@
           <w:color w:val="7F7F7F"/>
           <w:sz w:val="16"/>
         </w:rPr>
-        <w:t xml:space="preserve">   · slide 4 of 14</w:t>
+        <w:t xml:space="preserve">   · slide 4 of 15</w:t>
       </w:r>
     </w:p>
     <w:p>
@@ -576,7 +576,7 @@
           <w:color w:val="7F7F7F"/>
           <w:sz w:val="16"/>
         </w:rPr>
-        <w:t xml:space="preserve">   · slide 5 of 14</w:t>
+        <w:t xml:space="preserve">   · slide 5 of 15</w:t>
       </w:r>
     </w:p>
     <w:p>
@@ -754,7 +754,7 @@
           <w:color w:val="7F7F7F"/>
           <w:sz w:val="16"/>
         </w:rPr>
-        <w:t xml:space="preserve">   · slide 6 of 14</w:t>
+        <w:t xml:space="preserve">   · slide 6 of 15</w:t>
       </w:r>
     </w:p>
     <w:p>
@@ -889,7 +889,7 @@
           <w:color w:val="7F7F7F"/>
           <w:sz w:val="16"/>
         </w:rPr>
-        <w:t xml:space="preserve">   · slide 7 of 14</w:t>
+        <w:t xml:space="preserve">   · slide 7 of 15</w:t>
       </w:r>
     </w:p>
     <w:p>
@@ -1060,7 +1060,7 @@
           <w:color w:val="7F7F7F"/>
           <w:sz w:val="16"/>
         </w:rPr>
-        <w:t xml:space="preserve">   · slide 8 of 14</w:t>
+        <w:t xml:space="preserve">   · slide 8 of 15</w:t>
       </w:r>
     </w:p>
     <w:p>
@@ -1077,7 +1077,7 @@
           <w:color w:val="6B8E3F"/>
           <w:sz w:val="18"/>
         </w:rPr>
-        <w:t xml:space="preserve">E14 · 8:01–8:20 · </w:t>
+        <w:t xml:space="preserve">E14 · 8:01–8:08 · </w:t>
       </w:r>
       <w:r>
         <w:rPr>
@@ -1140,7 +1140,7 @@
         <w:spacing w:before="0" w:after="60"/>
       </w:pPr>
       <w:r>
-        <w:t>3. Three asks: come, bring your journal, bring the whole family to Evening 16 — calendar it today, date visible on the board.</w:t>
+        <w:t>3. Keep it to seven minutes; Ready, and Not Yet follows. 4. Three asks: come, bring your journal, bring the whole family to Evening 16 — calendar it today, date visible on the board.</w:t>
       </w:r>
     </w:p>
     <w:p>
@@ -1204,6 +1204,154 @@
           <w:color w:val="2C5F2D"/>
           <w:sz w:val="24"/>
         </w:rPr>
+        <w:t xml:space="preserve">   Ready, and Not Yet</w:t>
+      </w:r>
+      <w:r>
+        <w:rPr>
+          <w:b/>
+          <w:color w:val="B45309"/>
+          <w:sz w:val="17"/>
+        </w:rPr>
+        <w:t xml:space="preserve">    CONTENT PRESENTER</w:t>
+      </w:r>
+      <w:r>
+        <w:rPr>
+          <w:b w:val="0"/>
+          <w:color w:val="7F7F7F"/>
+          <w:sz w:val="16"/>
+        </w:rPr>
+        <w:t xml:space="preserve">   · slide 9 of 15</w:t>
+      </w:r>
+    </w:p>
+    <w:p>
+      <w:pPr>
+        <w:keepNext/>
+        <w:pBdr>
+          <w:left w:val="double" w:sz="12" w:space="8" w:color="B45309"/>
+        </w:pBdr>
+        <w:spacing w:before="0" w:after="60"/>
+      </w:pPr>
+      <w:r>
+        <w:rPr>
+          <w:b/>
+          <w:color w:val="6B8E3F"/>
+          <w:sz w:val="18"/>
+        </w:rPr>
+        <w:t xml:space="preserve">E14 · 8:08–8:20 · </w:t>
+      </w:r>
+      <w:r>
+        <w:rPr>
+          <w:b/>
+          <w:color w:val="B45309"/>
+          <w:sz w:val="18"/>
+        </w:rPr>
+        <w:t>LEAD: CONTENT PRESENTER CIRCLE</w:t>
+      </w:r>
+      <w:r>
+        <w:rPr>
+          <w:b/>
+          <w:color w:val="6B8E3F"/>
+          <w:sz w:val="18"/>
+        </w:rPr>
+      </w:r>
+    </w:p>
+    <w:p>
+      <w:pPr>
+        <w:pBdr>
+          <w:left w:val="double" w:sz="12" w:space="8" w:color="B45309"/>
+        </w:pBdr>
+        <w:spacing w:before="0" w:after="60"/>
+      </w:pPr>
+      <w:r>
+        <w:rPr>
+          <w:b/>
+          <w:color w:val="595959"/>
+        </w:rPr>
+        <w:t xml:space="preserve">BEATS: </w:t>
+      </w:r>
+      <w:r>
+        <w:t>1. Bridge from the sentence: 'If the evenings stop holding you, what can you hold now? Where do you still need someone?' 2. Write, 3 minutes, all three questions: what can I do now, on my own, that I couldn't when we started? where do I still need someone beside me — a parent, an adult, this group? what would help me move one 'not yet' toward ready before we are sent? 3. Pairs within families, 6 minutes: the parent answers first — parents tell first. Then the parent names one place they see their teen ready, and one place they still want to walk beside them. 4. Room round, 3 minutes: one 'ready' each, out loud; a parent begins. The 'not yets' stay in the pair.</w:t>
+      </w:r>
+    </w:p>
+    <w:p>
+      <w:pPr>
+        <w:pBdr>
+          <w:left w:val="double" w:sz="12" w:space="8" w:color="B45309"/>
+        </w:pBdr>
+        <w:spacing w:before="0" w:after="60"/>
+      </w:pPr>
+      <w:r>
+        <w:rPr>
+          <w:b/>
+          <w:color w:val="595959"/>
+        </w:rPr>
+        <w:t xml:space="preserve">CUES: </w:t>
+      </w:r>
+      <w:r>
+        <w:t>Never cold-call a teen; pass-anytime holds. The shrinking answer to 'where do I still need an adult?' is the measure the room has been watching since the Session 6 leader questions; say so lightly, once.</w:t>
+      </w:r>
+    </w:p>
+    <w:p>
+      <w:pPr>
+        <w:pBdr>
+          <w:left w:val="double" w:sz="12" w:space="8" w:color="B45309"/>
+        </w:pBdr>
+        <w:spacing w:before="0" w:after="60"/>
+      </w:pPr>
+      <w:r>
+        <w:rPr>
+          <w:b/>
+          <w:color w:val="595959"/>
+        </w:rPr>
+        <w:t xml:space="preserve">GUARD: </w:t>
+      </w:r>
+      <w:r>
+        <w:t>'Not yet' is honest, never a failure. This is about practices and leading, not anyone's standing with God. Nothing is written down by the team and nothing is graded; it is the room reading itself. A 'not yet' that is heavy gets a follow-up within the week, not a fix tonight.</w:t>
+      </w:r>
+    </w:p>
+    <w:p>
+      <w:pPr>
+        <w:pBdr>
+          <w:left w:val="double" w:sz="12" w:space="8" w:color="B45309"/>
+        </w:pBdr>
+        <w:spacing w:before="0" w:after="60"/>
+      </w:pPr>
+      <w:r>
+        <w:rPr>
+          <w:b/>
+          <w:color w:val="595959"/>
+        </w:rPr>
+        <w:t xml:space="preserve">FROM: </w:t>
+      </w:r>
+      <w:r>
+        <w:t>John's word, 13 October; the S6 leader questions ('Can you do things now you couldn't in August?' 'Where do you still need an adult?') and the 13 October dinner sheet.</w:t>
+      </w:r>
+    </w:p>
+    <w:p>
+      <w:pPr>
+        <w:keepNext/>
+        <w:pBdr>
+          <w:left w:val="double" w:sz="12" w:space="8" w:color="B45309"/>
+        </w:pBdr>
+        <w:shd w:val="clear" w:color="auto" w:fill="FCE9D6"/>
+        <w:spacing w:before="160" w:after="40"/>
+      </w:pPr>
+      <w:r>
+        <w:rPr>
+          <w:rFonts w:ascii="Cambria" w:hAnsi="Cambria"/>
+          <w:b/>
+          <w:color w:val="B45309"/>
+          <w:sz w:val="30"/>
+        </w:rPr>
+        <w:t>264</w:t>
+      </w:r>
+      <w:r>
+        <w:rPr>
+          <w:rFonts w:ascii="Cambria" w:hAnsi="Cambria"/>
+          <w:b/>
+          <w:color w:val="2C5F2D"/>
+          <w:sz w:val="24"/>
+        </w:rPr>
         <w:t xml:space="preserve">   Homework — Two Weeks, Four Parts</w:t>
       </w:r>
       <w:r>
@@ -1220,7 +1368,7 @@
           <w:color w:val="7F7F7F"/>
           <w:sz w:val="16"/>
         </w:rPr>
-        <w:t xml:space="preserve">   · slide 9 of 14</w:t>
+        <w:t xml:space="preserve">   · slide 10 of 15</w:t>
       </w:r>
     </w:p>
     <w:p>
@@ -1300,7 +1448,7 @@
         <w:spacing w:before="0" w:after="60"/>
       </w:pPr>
       <w:r>
-        <w:t>3. The Four Questions word to parents — one paragraph, spoken to the middle distance, moved past without pausing for reaction: willing-only, not-yet counts, nobody checks.</w:t>
+        <w:t>3. The invitation list (John's word, 13 October): start a list of who you would invite to the follow-up series — names, not categories; pray over it before asking anyone. The group decides together, after Evening 17, what the follow-up is; the list is how each family comes ready to that conversation. Names stay in journals; nobody is asked to say them tonight, and the team keeps no list. 4. The Four Questions word to parents — one paragraph, spoken to the middle distance, moved past without pausing for reaction: willing-only, not-yet counts, nobody checks.</w:t>
       </w:r>
     </w:p>
     <w:p>
@@ -1337,7 +1485,7 @@
           <w:color w:val="B45309"/>
           <w:sz w:val="30"/>
         </w:rPr>
-        <w:t>264</w:t>
+        <w:t>265</w:t>
       </w:r>
       <w:r>
         <w:rPr>
@@ -1362,7 +1510,7 @@
           <w:color w:val="7F7F7F"/>
           <w:sz w:val="16"/>
         </w:rPr>
-        <w:t xml:space="preserve">   · slide 10 of 14</w:t>
+        <w:t xml:space="preserve">   · slide 11 of 15</w:t>
       </w:r>
     </w:p>
     <w:p>
@@ -1479,7 +1627,7 @@
           <w:color w:val="B45309"/>
           <w:sz w:val="30"/>
         </w:rPr>
-        <w:t>265</w:t>
+        <w:t>266</w:t>
       </w:r>
       <w:r>
         <w:rPr>
@@ -1504,7 +1652,7 @@
           <w:color w:val="7F7F7F"/>
           <w:sz w:val="16"/>
         </w:rPr>
-        <w:t xml:space="preserve">   · slide 11 of 14</w:t>
+        <w:t xml:space="preserve">   · slide 12 of 15</w:t>
       </w:r>
     </w:p>
     <w:p>
@@ -1610,7 +1758,7 @@
           <w:color w:val="1F4E79"/>
           <w:sz w:val="30"/>
         </w:rPr>
-        <w:t>266</w:t>
+        <w:t>267</w:t>
       </w:r>
       <w:r>
         <w:rPr>
@@ -1635,7 +1783,7 @@
           <w:color w:val="7F7F7F"/>
           <w:sz w:val="16"/>
         </w:rPr>
-        <w:t xml:space="preserve">   · slide 12 of 14</w:t>
+        <w:t xml:space="preserve">   · slide 13 of 15</w:t>
       </w:r>
     </w:p>
     <w:p>
@@ -1770,7 +1918,7 @@
           <w:color w:val="6B3FA0"/>
           <w:sz w:val="30"/>
         </w:rPr>
-        <w:t>267</w:t>
+        <w:t>268</w:t>
       </w:r>
       <w:r>
         <w:rPr>
@@ -1795,7 +1943,7 @@
           <w:color w:val="7F7F7F"/>
           <w:sz w:val="16"/>
         </w:rPr>
-        <w:t xml:space="preserve">   · slide 13 of 14</w:t>
+        <w:t xml:space="preserve">   · slide 14 of 15</w:t>
       </w:r>
     </w:p>
     <w:p>
@@ -1912,7 +2060,7 @@
           <w:color w:val="1F4E79"/>
           <w:sz w:val="30"/>
         </w:rPr>
-        <w:t>268</w:t>
+        <w:t>269</w:t>
       </w:r>
       <w:r>
         <w:rPr>
@@ -1937,7 +2085,7 @@
           <w:color w:val="7F7F7F"/>
           <w:sz w:val="16"/>
         </w:rPr>
-        <w:t xml:space="preserve">   · slide 14 of 14</w:t>
+        <w:t xml:space="preserve">   · slide 15 of 15</w:t>
       </w:r>
     </w:p>
     <w:p>

</xml_diff>